<commit_message>
Align final report with lecture methods
</commit_message>
<xml_diff>
--- a/SPACE312_Final_Project_Report_KR_final.docx
+++ b/SPACE312_Final_Project_Report_KR_final.docx
@@ -360,7 +360,7 @@
         <w:ind w:left="216"/>
       </w:pPr>
       <w:r>
-        <w:t>3. Mission priority 설정</w:t>
+        <w:t>3. 수업 내용과의 연결</w:t>
       </w:r>
     </w:p>
     <w:p>
@@ -369,7 +369,7 @@
         <w:ind w:left="216"/>
       </w:pPr>
       <w:r>
-        <w:t>4. 최적화 문제와 Pareto 평가</w:t>
+        <w:t>4. Mission priority 설정</w:t>
       </w:r>
     </w:p>
     <w:p>
@@ -378,7 +378,7 @@
         <w:ind w:left="216"/>
       </w:pPr>
       <w:r>
-        <w:t>5. 탐색 방법 및 코드 구성</w:t>
+        <w:t>5. 최적화 문제와 Pareto 평가</w:t>
       </w:r>
     </w:p>
     <w:p>
@@ -387,7 +387,7 @@
         <w:ind w:left="216"/>
       </w:pPr>
       <w:r>
-        <w:t>6. Pareto 결과와 knee point 판단</w:t>
+        <w:t>6. 탐색 방법 및 코드 구성</w:t>
       </w:r>
     </w:p>
     <w:p>
@@ -396,7 +396,7 @@
         <w:ind w:left="216"/>
       </w:pPr>
       <w:r>
-        <w:t>7. 최종 대표 설계점</w:t>
+        <w:t>7. Pareto 결과와 knee point 판단</w:t>
       </w:r>
     </w:p>
     <w:p>
@@ -405,7 +405,7 @@
         <w:ind w:left="216"/>
       </w:pPr>
       <w:r>
-        <w:t>8. 궤적, 오차, 가시성 결과</w:t>
+        <w:t>8. 최종 대표 설계점</w:t>
       </w:r>
     </w:p>
     <w:p>
@@ -414,7 +414,16 @@
         <w:ind w:left="216"/>
       </w:pPr>
       <w:r>
-        <w:t>9. 결론</w:t>
+        <w:t>9. 궤적, 오차, 가시성 결과</w:t>
+      </w:r>
+    </w:p>
+    <w:p>
+      <w:pPr>
+        <w:spacing w:after="40"/>
+        <w:ind w:left="216"/>
+      </w:pPr>
+      <w:r>
+        <w:t>10. 결론</w:t>
       </w:r>
     </w:p>
     <w:p>
@@ -760,7 +769,301 @@
         <w:rPr>
           <w:color w:val="1F4E79"/>
         </w:rPr>
-        <w:t>3. Mission priority 설정</w:t>
+        <w:t>3. 수업 내용과의 연결</w:t>
+      </w:r>
+    </w:p>
+    <w:p>
+      <w:pPr>
+        <w:spacing w:after="140" w:line="269" w:lineRule="auto"/>
+      </w:pPr>
+      <w:r>
+        <w:t>본 설계는 수업에서 다룬 개념을 조합해서 구성하였다. 따라서 최종 결과는 임의의 black-box optimizer가 아니라, 강의에서 배운 궤도역학 절차를 코드로 반복 적용한 결과이다. 사용한 핵심 개념은 다음과 같다.</w:t>
+      </w:r>
+    </w:p>
+    <w:tbl>
+      <w:tblPr>
+        <w:tblW w:type="auto" w:w="0"/>
+        <w:jc w:val="center"/>
+        <w:tblLayout w:type="autofit"/>
+        <w:tblLook w:firstColumn="1" w:firstRow="1" w:lastColumn="0" w:lastRow="0" w:noHBand="0" w:noVBand="1" w:val="04A0"/>
+        <w:tblBorders>
+          <w:top w:val="single" w:sz="6" w:space="0" w:color="B7C4D6"/>
+          <w:left w:val="single" w:sz="6" w:space="0" w:color="B7C4D6"/>
+          <w:bottom w:val="single" w:sz="6" w:space="0" w:color="B7C4D6"/>
+          <w:right w:val="single" w:sz="6" w:space="0" w:color="B7C4D6"/>
+          <w:insideH w:val="single" w:sz="6" w:space="0" w:color="B7C4D6"/>
+          <w:insideV w:val="single" w:sz="6" w:space="0" w:color="B7C4D6"/>
+        </w:tblBorders>
+      </w:tblPr>
+      <w:tblGrid>
+        <w:gridCol w:w="4824"/>
+        <w:gridCol w:w="4824"/>
+      </w:tblGrid>
+      <w:tr>
+        <w:tc>
+          <w:tcPr>
+            <w:tcW w:type="dxa" w:w="4824"/>
+            <w:vAlign w:val="center"/>
+            <w:shd w:fill="D9EAF7"/>
+          </w:tcPr>
+          <w:p>
+            <w:pPr>
+              <w:spacing w:after="0"/>
+            </w:pPr>
+            <w:r/>
+            <w:r>
+              <w:rPr>
+                <w:b/>
+                <w:sz w:val="18"/>
+              </w:rPr>
+              <w:t>Two-body equation</w:t>
+            </w:r>
+          </w:p>
+        </w:tc>
+        <w:tc>
+          <w:tcPr>
+            <w:tcW w:type="dxa" w:w="4824"/>
+            <w:vAlign w:val="center"/>
+          </w:tcPr>
+          <w:p>
+            <w:pPr>
+              <w:spacing w:after="0"/>
+            </w:pPr>
+            <w:r/>
+            <w:r>
+              <w:rPr>
+                <w:b w:val="0"/>
+                <w:sz w:val="18"/>
+              </w:rPr>
+              <w:t>지구 중심 2체 문제로 GTO와 GEO state를 전파</w:t>
+            </w:r>
+          </w:p>
+        </w:tc>
+      </w:tr>
+      <w:tr>
+        <w:tc>
+          <w:tcPr>
+            <w:tcW w:type="dxa" w:w="4824"/>
+            <w:vAlign w:val="center"/>
+            <w:shd w:fill="D9EAF7"/>
+          </w:tcPr>
+          <w:p>
+            <w:pPr>
+              <w:spacing w:after="0"/>
+            </w:pPr>
+            <w:r/>
+            <w:r>
+              <w:rPr>
+                <w:b/>
+                <w:sz w:val="18"/>
+              </w:rPr>
+              <w:t>Impulsive maneuver</w:t>
+            </w:r>
+          </w:p>
+        </w:tc>
+        <w:tc>
+          <w:tcPr>
+            <w:tcW w:type="dxa" w:w="4824"/>
+            <w:vAlign w:val="center"/>
+          </w:tcPr>
+          <w:p>
+            <w:pPr>
+              <w:spacing w:after="0"/>
+            </w:pPr>
+            <w:r/>
+            <w:r>
+              <w:rPr>
+                <w:b w:val="0"/>
+                <w:sz w:val="18"/>
+              </w:rPr>
+              <w:t>출발과 도착에서 속도 벡터 차이로 Delta V 계산</w:t>
+            </w:r>
+          </w:p>
+        </w:tc>
+      </w:tr>
+      <w:tr>
+        <w:tc>
+          <w:tcPr>
+            <w:tcW w:type="dxa" w:w="4824"/>
+            <w:vAlign w:val="center"/>
+            <w:shd w:fill="D9EAF7"/>
+          </w:tcPr>
+          <w:p>
+            <w:pPr>
+              <w:spacing w:after="0"/>
+            </w:pPr>
+            <w:r/>
+            <w:r>
+              <w:rPr>
+                <w:b/>
+                <w:sz w:val="18"/>
+              </w:rPr>
+              <w:t>Lambert problem</w:t>
+            </w:r>
+          </w:p>
+        </w:tc>
+        <w:tc>
+          <w:tcPr>
+            <w:tcW w:type="dxa" w:w="4824"/>
+            <w:vAlign w:val="center"/>
+          </w:tcPr>
+          <w:p>
+            <w:pPr>
+              <w:spacing w:after="0"/>
+            </w:pPr>
+            <w:r/>
+            <w:r>
+              <w:rPr>
+                <w:b w:val="0"/>
+                <w:sz w:val="18"/>
+              </w:rPr>
+              <w:t>주어진 r1, r2, Delta t에 대해 transfer velocity 계산</w:t>
+            </w:r>
+          </w:p>
+        </w:tc>
+      </w:tr>
+      <w:tr>
+        <w:tc>
+          <w:tcPr>
+            <w:tcW w:type="dxa" w:w="4824"/>
+            <w:vAlign w:val="center"/>
+            <w:shd w:fill="D9EAF7"/>
+          </w:tcPr>
+          <w:p>
+            <w:pPr>
+              <w:spacing w:after="0"/>
+            </w:pPr>
+            <w:r/>
+            <w:r>
+              <w:rPr>
+                <w:b/>
+                <w:sz w:val="18"/>
+              </w:rPr>
+              <w:t>Inclination/plane change idea</w:t>
+            </w:r>
+          </w:p>
+        </w:tc>
+        <w:tc>
+          <w:tcPr>
+            <w:tcW w:type="dxa" w:w="4824"/>
+            <w:vAlign w:val="center"/>
+          </w:tcPr>
+          <w:p>
+            <w:pPr>
+              <w:spacing w:after="0"/>
+            </w:pPr>
+            <w:r/>
+            <w:r>
+              <w:rPr>
+                <w:b w:val="0"/>
+                <w:sz w:val="18"/>
+              </w:rPr>
+              <w:t>초기 GTO의 z방향 속도와 GEO의 equatorial 조건이 Delta V에 반영됨</w:t>
+            </w:r>
+          </w:p>
+        </w:tc>
+      </w:tr>
+      <w:tr>
+        <w:tc>
+          <w:tcPr>
+            <w:tcW w:type="dxa" w:w="4824"/>
+            <w:vAlign w:val="center"/>
+            <w:shd w:fill="D9EAF7"/>
+          </w:tcPr>
+          <w:p>
+            <w:pPr>
+              <w:spacing w:after="0"/>
+            </w:pPr>
+            <w:r/>
+            <w:r>
+              <w:rPr>
+                <w:b/>
+                <w:sz w:val="18"/>
+              </w:rPr>
+              <w:t>ECI to ECEF and SEZ</w:t>
+            </w:r>
+          </w:p>
+        </w:tc>
+        <w:tc>
+          <w:tcPr>
+            <w:tcW w:type="dxa" w:w="4824"/>
+            <w:vAlign w:val="center"/>
+          </w:tcPr>
+          <w:p>
+            <w:pPr>
+              <w:spacing w:after="0"/>
+            </w:pPr>
+            <w:r/>
+            <w:r>
+              <w:rPr>
+                <w:b w:val="0"/>
+                <w:sz w:val="18"/>
+              </w:rPr>
+              <w:t>KHU 지상국 기준 elevation과 visibility interval 계산</w:t>
+            </w:r>
+          </w:p>
+        </w:tc>
+      </w:tr>
+      <w:tr>
+        <w:tc>
+          <w:tcPr>
+            <w:tcW w:type="dxa" w:w="4824"/>
+            <w:vAlign w:val="center"/>
+            <w:shd w:fill="D9EAF7"/>
+          </w:tcPr>
+          <w:p>
+            <w:pPr>
+              <w:spacing w:after="0"/>
+            </w:pPr>
+            <w:r/>
+            <w:r>
+              <w:rPr>
+                <w:b/>
+                <w:sz w:val="18"/>
+              </w:rPr>
+              <w:t>Pork-chop/Pareto idea</w:t>
+            </w:r>
+          </w:p>
+        </w:tc>
+        <w:tc>
+          <w:tcPr>
+            <w:tcW w:type="dxa" w:w="4824"/>
+            <w:vAlign w:val="center"/>
+          </w:tcPr>
+          <w:p>
+            <w:pPr>
+              <w:spacing w:after="0"/>
+            </w:pPr>
+            <w:r/>
+            <w:r>
+              <w:rPr>
+                <w:b w:val="0"/>
+                <w:sz w:val="18"/>
+              </w:rPr>
+              <w:t>transfer time을 sweep하여 Delta V와 시간의 tradeoff를 비교</w:t>
+            </w:r>
+          </w:p>
+        </w:tc>
+      </w:tr>
+    </w:tbl>
+    <w:p/>
+    <w:p>
+      <w:pPr>
+        <w:spacing w:after="140" w:line="269" w:lineRule="auto"/>
+      </w:pPr>
+      <w:r>
+        <w:t>즉, 본 과제의 계산 흐름은 '시간을 하나 정한다 -&gt; 해당 시각의 GEO 목표 state를 구한다 -&gt; Lambert 문제를 푼다 -&gt; 두 번의 impulsive Delta V를 계산한다 -&gt; 여러 시간 후보 중 Pareto 후보를 남긴다'이다. 이 방식은 수업에서 배운 Lambert transfer와 pork-chop 형태의 trade-space 탐색을 그대로 과제 조건에 적용한 것이다.</w:t>
+      </w:r>
+    </w:p>
+    <w:p>
+      <w:pPr>
+        <w:pStyle w:val="Heading1"/>
+      </w:pPr>
+      <w:r>
+        <w:rPr>
+          <w:color w:val="1F4E79"/>
+        </w:rPr>
+        <w:t>4. Mission priority 설정</w:t>
       </w:r>
     </w:p>
     <w:p>
@@ -814,7 +1117,7 @@
         <w:rPr>
           <w:color w:val="1F4E79"/>
         </w:rPr>
-        <w:t>4. 최적화 문제와 Pareto 평가</w:t>
+        <w:t>5. 최적화 문제와 Pareto 평가</w:t>
       </w:r>
     </w:p>
     <w:p>
@@ -869,7 +1172,7 @@
         <w:rPr>
           <w:color w:val="1F4E79"/>
         </w:rPr>
-        <w:t>5. 탐색 방법 및 코드 구성</w:t>
+        <w:t>6. 탐색 방법 및 코드 구성</w:t>
       </w:r>
     </w:p>
     <w:p>
@@ -878,6 +1181,14 @@
       </w:pPr>
       <w:r>
         <w:t>코드는 1일에서 30일까지의 transfer duration을 조밀하게 sweep하며 Lambert problem을 풀었다. 각 시간에 대해 목표 GEO state를 전파하고, 초기 GTO 위치에서 해당 목표 위치까지 연결하는 Lambert velocity를 구한 뒤 두 번의 impulsive maneuver 크기를 계산하였다.</w:t>
+      </w:r>
+    </w:p>
+    <w:p>
+      <w:pPr>
+        <w:spacing w:after="140" w:line="269" w:lineRule="auto"/>
+      </w:pPr>
+      <w:r>
+        <w:t>중요한 점은 제출 결과가 MATLAB의 black-box 최적화 함수로 만들어진 것이 아니라는 점이다. 코드에는 검산용 direct-shooting 옵션이 남아 있지만 기본값은 false이며, 본 보고서의 표와 그림은 Lambert sweep 결과와 Pareto filtering만으로 생성하였다. 따라서 결과 해석은 수업에서 배운 Lambert transfer, two-body propagation, impulsive Delta V 계산에 기반한다.</w:t>
       </w:r>
     </w:p>
     <w:p>
@@ -896,7 +1207,7 @@
         <w:rPr>
           <w:color w:val="1F4E79"/>
         </w:rPr>
-        <w:t>6. Pareto 결과와 knee point 판단</w:t>
+        <w:t>7. Pareto 결과와 knee point 판단</w:t>
       </w:r>
     </w:p>
     <w:p>
@@ -2189,7 +2500,7 @@
         <w:rPr>
           <w:color w:val="1F4E79"/>
         </w:rPr>
-        <w:t>7. 최종 대표 설계점</w:t>
+        <w:t>8. 최종 대표 설계점</w:t>
       </w:r>
     </w:p>
     <w:p>
@@ -2434,7 +2745,7 @@
         <w:rPr>
           <w:color w:val="1F4E79"/>
         </w:rPr>
-        <w:t>8. 궤적, 오차, 가시성 결과</w:t>
+        <w:t>9. 궤적, 오차, 가시성 결과</w:t>
       </w:r>
     </w:p>
     <w:p>
@@ -2718,7 +3029,7 @@
         <w:rPr>
           <w:color w:val="1F4E79"/>
         </w:rPr>
-        <w:t>9. 결론</w:t>
+        <w:t>10. 결론</w:t>
       </w:r>
     </w:p>
     <w:p>
@@ -2764,6 +3075,15 @@
       </w:pPr>
       <w:r>
         <w:t>targetStateMode = PDF_GIVEN: project PDF Section 3.2 target state vector를 그대로 사용</w:t>
+      </w:r>
+    </w:p>
+    <w:p>
+      <w:pPr>
+        <w:pStyle w:val="ListBullet"/>
+        <w:spacing w:after="60"/>
+      </w:pPr>
+      <w:r>
+        <w:t>runShootingRefinement = false: 제출 결과는 optimizer가 아니라 수업 기반 Lambert sweep으로 생성</w:t>
       </w:r>
     </w:p>
     <w:p>

</xml_diff>